<commit_message>
UPD CFA + Material zip
</commit_message>
<xml_diff>
--- a/fuentes/72312210_CF1_DU.docx
+++ b/fuentes/72312210_CF1_DU.docx
@@ -238,7 +238,7 @@
         <mc:AlternateContent>
           <mc:Choice Requires="wps">
             <w:drawing>
-              <wp:anchor distT="45720" distB="45720" distL="114300" distR="114300" simplePos="0" relativeHeight="251663360" behindDoc="0" locked="0" layoutInCell="1" allowOverlap="1" wp14:anchorId="2E2DABF6" wp14:editId="7BC8AA55">
+              <wp:anchor distT="45720" distB="45720" distL="114300" distR="114300" simplePos="0" relativeHeight="251663360" behindDoc="0" locked="0" layoutInCell="1" allowOverlap="1" wp14:anchorId="2E2DABF6" wp14:editId="09FDCE79">
                 <wp:simplePos x="0" y="0"/>
                 <wp:positionH relativeFrom="margin">
                   <wp:align>left</wp:align>
@@ -246,7 +246,7 @@
                 <wp:positionV relativeFrom="paragraph">
                   <wp:posOffset>83186</wp:posOffset>
                 </wp:positionV>
-                <wp:extent cx="6858000" cy="1781175"/>
+                <wp:extent cx="6677025" cy="1781175"/>
                 <wp:effectExtent l="0" t="0" r="0" b="9525"/>
                 <wp:wrapNone/>
                 <wp:docPr id="217" name="Cuadro de texto 2">
@@ -268,7 +268,7 @@
                       <wps:spPr bwMode="auto">
                         <a:xfrm>
                           <a:off x="0" y="0"/>
-                          <a:ext cx="6858000" cy="1781175"/>
+                          <a:ext cx="6677025" cy="1781175"/>
                         </a:xfrm>
                         <a:prstGeom prst="rect">
                           <a:avLst/>
@@ -336,7 +336,7 @@
                 <v:stroke joinstyle="miter"/>
                 <v:path gradientshapeok="t" o:connecttype="rect"/>
               </v:shapetype>
-              <v:shape id="Cuadro de texto 2" o:spid="_x0000_s1026" type="#_x0000_t202" alt="&quot;&quot;" style="position:absolute;left:0;text-align:left;margin-left:0;margin-top:6.55pt;width:540pt;height:140.25pt;z-index:251663360;visibility:visible;mso-wrap-style:square;mso-width-percent:0;mso-height-percent:0;mso-wrap-distance-left:9pt;mso-wrap-distance-top:3.6pt;mso-wrap-distance-right:9pt;mso-wrap-distance-bottom:3.6pt;mso-position-horizontal:left;mso-position-horizontal-relative:margin;mso-position-vertical:absolute;mso-position-vertical-relative:text;mso-width-percent:0;mso-height-percent:0;mso-width-relative:margin;mso-height-relative:margin;v-text-anchor:top" o:gfxdata="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" filled="f" stroked="f">
+              <v:shape id="Cuadro de texto 2" o:spid="_x0000_s1026" type="#_x0000_t202" alt="&quot;&quot;" style="position:absolute;left:0;text-align:left;margin-left:0;margin-top:6.55pt;width:525.75pt;height:140.25pt;z-index:251663360;visibility:visible;mso-wrap-style:square;mso-width-percent:0;mso-height-percent:0;mso-wrap-distance-left:9pt;mso-wrap-distance-top:3.6pt;mso-wrap-distance-right:9pt;mso-wrap-distance-bottom:3.6pt;mso-position-horizontal:left;mso-position-horizontal-relative:margin;mso-position-vertical:absolute;mso-position-vertical-relative:text;mso-width-percent:0;mso-height-percent:0;mso-width-relative:margin;mso-height-relative:margin;v-text-anchor:top" o:gfxdata="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" filled="f" stroked="f">
                 <v:textbox>
                   <w:txbxContent>
                     <w:p>
@@ -561,7 +561,6 @@
           <w:docPartUnique/>
         </w:docPartObj>
       </w:sdtPr>
-      <w:sdtEndPr/>
       <w:sdtContent>
         <w:p>
           <w:pPr>
@@ -3006,7 +3005,13 @@
               <w:spacing w:before="0" w:after="0"/>
             </w:pPr>
             <w:r>
-              <w:t>Un vehículo excepcional para este intercambio es la metodología del campesino a campesino (CASA), basada en la horizontalidad y el aprendizaje práctico de aprender haciendo. Esta estrategia permite que los saberes circulen libremente en la comunidad, validando las innovaciones desde la práctica misma en el campo. En este entorno, el técnico no impone, sino que actúa como facilitador, mientras que el campesino lidera la transformación de su propio territorio.</w:t>
+              <w:t>Un vehículo excepcional para este intercambio es la metodología del campesino a campesino (CA</w:t>
+            </w:r>
+            <w:r>
+              <w:t>C</w:t>
+            </w:r>
+            <w:r>
+              <w:t>), basada en la horizontalidad y el aprendizaje práctico de aprender haciendo. Esta estrategia permite que los saberes circulen libremente en la comunidad, validando las innovaciones desde la práctica misma en el campo. En este entorno, el técnico no impone, sino que actúa como facilitador, mientras que el campesino lidera la transformación de su propio territorio.</w:t>
             </w:r>
           </w:p>
           <w:p>
@@ -3995,13 +4000,6 @@
               </w:rPr>
               <w:t>Externos (químicos)</w:t>
             </w:r>
-            <w:r>
-              <w:rPr>
-                <w:sz w:val="28"/>
-                <w:szCs w:val="28"/>
-              </w:rPr>
-              <w:t>.</w:t>
-            </w:r>
           </w:p>
         </w:tc>
         <w:tc>
@@ -4024,13 +4022,6 @@
                 <w:szCs w:val="28"/>
               </w:rPr>
               <w:t>Internos (naturales)</w:t>
-            </w:r>
-            <w:r>
-              <w:rPr>
-                <w:sz w:val="28"/>
-                <w:szCs w:val="28"/>
-              </w:rPr>
-              <w:t>.</w:t>
             </w:r>
           </w:p>
         </w:tc>
@@ -4263,13 +4254,6 @@
               </w:rPr>
               <w:t>Técnico + tradicional</w:t>
             </w:r>
-            <w:r>
-              <w:rPr>
-                <w:sz w:val="28"/>
-                <w:szCs w:val="28"/>
-              </w:rPr>
-              <w:t>.</w:t>
-            </w:r>
           </w:p>
         </w:tc>
       </w:tr>
@@ -4525,9 +4509,34 @@
     </w:p>
     <w:p>
       <w:pPr>
+        <w:pStyle w:val="Prrafodelista"/>
+        <w:numPr>
+          <w:ilvl w:val="0"/>
+          <w:numId w:val="7"/>
+        </w:numPr>
+        <w:spacing w:after="0"/>
+        <w:rPr>
+          <w:b/>
+          <w:bCs/>
+        </w:rPr>
+      </w:pPr>
+      <w:r>
+        <w:rPr>
+          <w:b/>
+          <w:bCs/>
+        </w:rPr>
+        <w:lastRenderedPageBreak/>
+        <w:t>Sinergias biológicas</w:t>
+      </w:r>
+    </w:p>
+    <w:p>
+      <w:pPr>
         <w:spacing w:before="0" w:after="0"/>
         <w:ind w:firstLine="708"/>
       </w:pPr>
+      <w:r>
+        <w:t>Las sinergias biológicas se refieren a las interacciones positivas que se establecen entre los diferentes organismos dentro del agroecosistema. Estas relaciones pueden darse entre plantas, animales, microorganismos y otros componentes del sistema.</w:t>
+      </w:r>
     </w:p>
     <w:p>
       <w:pPr>
@@ -4543,7 +4552,49 @@
           <w:b/>
           <w:bCs/>
         </w:rPr>
-        <w:lastRenderedPageBreak/>
+        <w:t>Algunos ejemplos incluyen:</w:t>
+      </w:r>
+    </w:p>
+    <w:p>
+      <w:pPr>
+        <w:pStyle w:val="Prrafodelista"/>
+        <w:numPr>
+          <w:ilvl w:val="0"/>
+          <w:numId w:val="15"/>
+        </w:numPr>
+        <w:spacing w:before="0" w:after="0"/>
+      </w:pPr>
+      <w:r>
+        <w:t>Asociación de cultivos que se benefician mutuamente.</w:t>
+      </w:r>
+    </w:p>
+    <w:p>
+      <w:pPr>
+        <w:pStyle w:val="Prrafodelista"/>
+        <w:numPr>
+          <w:ilvl w:val="0"/>
+          <w:numId w:val="15"/>
+        </w:numPr>
+        <w:spacing w:before="0" w:after="0"/>
+      </w:pPr>
+      <w:r>
+        <w:t>Presencia de insectos benéficos que controlan plagas.</w:t>
+      </w:r>
+    </w:p>
+    <w:p>
+      <w:pPr>
+        <w:spacing w:after="0"/>
+        <w:ind w:firstLine="708"/>
+        <w:rPr>
+          <w:b/>
+          <w:bCs/>
+        </w:rPr>
+      </w:pPr>
+      <w:r>
+        <w:rPr>
+          <w:b/>
+          <w:bCs/>
+        </w:rPr>
         <w:t>Ejemplo de asociación benéfica de cultivos</w:t>
       </w:r>
     </w:p>
@@ -4560,29 +4611,30 @@
       <w:tblPr>
         <w:tblStyle w:val="SENA"/>
         <w:tblW w:w="0" w:type="auto"/>
-        <w:tblInd w:w="137" w:type="dxa"/>
         <w:tblLayout w:type="fixed"/>
         <w:tblLook w:val="04A0" w:firstRow="1" w:lastRow="0" w:firstColumn="1" w:lastColumn="0" w:noHBand="0" w:noVBand="1"/>
       </w:tblPr>
       <w:tblGrid>
-        <w:gridCol w:w="1842"/>
-        <w:gridCol w:w="2836"/>
-        <w:gridCol w:w="2551"/>
-        <w:gridCol w:w="2596"/>
+        <w:gridCol w:w="2122"/>
+        <w:gridCol w:w="2409"/>
+        <w:gridCol w:w="734"/>
+        <w:gridCol w:w="2243"/>
+        <w:gridCol w:w="2410"/>
       </w:tblGrid>
       <w:tr>
         <w:trPr>
           <w:cnfStyle w:val="100000000000" w:firstRow="1" w:lastRow="0" w:firstColumn="0" w:lastColumn="0" w:oddVBand="0" w:evenVBand="0" w:oddHBand="0" w:evenHBand="0" w:firstRowFirstColumn="0" w:firstRowLastColumn="0" w:lastRowFirstColumn="0" w:lastRowLastColumn="0"/>
-          <w:tblHeader/>
+          <w:trHeight w:val="360"/>
         </w:trPr>
         <w:tc>
           <w:tcPr>
-            <w:tcW w:w="1842" w:type="dxa"/>
+            <w:tcW w:w="2122" w:type="dxa"/>
           </w:tcPr>
           <w:p>
             <w:pPr>
               <w:pStyle w:val="TextoTablas"/>
               <w:spacing w:before="0" w:after="0" w:line="360" w:lineRule="auto"/>
+              <w:jc w:val="center"/>
               <w:rPr>
                 <w:rFonts w:asciiTheme="minorHAnsi" w:hAnsiTheme="minorHAnsi" w:cstheme="minorHAnsi"/>
                 <w:sz w:val="28"/>
@@ -4600,14 +4652,14 @@
         </w:tc>
         <w:tc>
           <w:tcPr>
-            <w:tcW w:w="2836" w:type="dxa"/>
+            <w:tcW w:w="2409" w:type="dxa"/>
           </w:tcPr>
           <w:p>
             <w:pPr>
               <w:pStyle w:val="TextoTablas"/>
               <w:spacing w:before="0" w:after="0" w:line="360" w:lineRule="auto"/>
-              <w:rPr>
-                <w:rFonts w:asciiTheme="minorHAnsi" w:hAnsiTheme="minorHAnsi" w:cstheme="minorHAnsi"/>
+              <w:jc w:val="center"/>
+              <w:rPr>
                 <w:sz w:val="28"/>
                 <w:szCs w:val="28"/>
               </w:rPr>
@@ -4623,35 +4675,54 @@
         </w:tc>
         <w:tc>
           <w:tcPr>
-            <w:tcW w:w="2551" w:type="dxa"/>
+            <w:tcW w:w="734" w:type="dxa"/>
+            <w:vMerge w:val="restart"/>
+            <w:shd w:val="clear" w:color="auto" w:fill="FFFFFF" w:themeFill="background1"/>
           </w:tcPr>
           <w:p>
             <w:pPr>
               <w:pStyle w:val="TextoTablas"/>
               <w:spacing w:before="0" w:after="0" w:line="360" w:lineRule="auto"/>
-              <w:rPr>
-                <w:rFonts w:asciiTheme="minorHAnsi" w:hAnsiTheme="minorHAnsi" w:cstheme="minorHAnsi"/>
+              <w:jc w:val="center"/>
+              <w:rPr>
                 <w:sz w:val="28"/>
                 <w:szCs w:val="28"/>
               </w:rPr>
             </w:pPr>
-            <w:r>
-              <w:rPr>
-                <w:sz w:val="28"/>
-                <w:szCs w:val="28"/>
-              </w:rPr>
-              <w:t>Cultivo</w:t>
-            </w:r>
           </w:p>
         </w:tc>
         <w:tc>
           <w:tcPr>
-            <w:tcW w:w="2596" w:type="dxa"/>
+            <w:tcW w:w="2243" w:type="dxa"/>
           </w:tcPr>
           <w:p>
             <w:pPr>
               <w:pStyle w:val="TextoTablas"/>
               <w:spacing w:before="0" w:after="0" w:line="360" w:lineRule="auto"/>
+              <w:jc w:val="center"/>
+              <w:rPr>
+                <w:sz w:val="28"/>
+                <w:szCs w:val="28"/>
+              </w:rPr>
+            </w:pPr>
+            <w:r>
+              <w:rPr>
+                <w:sz w:val="28"/>
+                <w:szCs w:val="28"/>
+              </w:rPr>
+              <w:t>Cultivo</w:t>
+            </w:r>
+          </w:p>
+        </w:tc>
+        <w:tc>
+          <w:tcPr>
+            <w:tcW w:w="2410" w:type="dxa"/>
+          </w:tcPr>
+          <w:p>
+            <w:pPr>
+              <w:pStyle w:val="TextoTablas"/>
+              <w:spacing w:before="0" w:after="0" w:line="360" w:lineRule="auto"/>
+              <w:jc w:val="center"/>
               <w:rPr>
                 <w:rFonts w:asciiTheme="minorHAnsi" w:hAnsiTheme="minorHAnsi" w:cstheme="minorHAnsi"/>
                 <w:sz w:val="28"/>
@@ -4671,16 +4742,17 @@
       <w:tr>
         <w:trPr>
           <w:cnfStyle w:val="000000100000" w:firstRow="0" w:lastRow="0" w:firstColumn="0" w:lastColumn="0" w:oddVBand="0" w:evenVBand="0" w:oddHBand="1" w:evenHBand="0" w:firstRowFirstColumn="0" w:firstRowLastColumn="0" w:lastRowFirstColumn="0" w:lastRowLastColumn="0"/>
-          <w:trHeight w:val="487"/>
+          <w:trHeight w:val="379"/>
         </w:trPr>
         <w:tc>
           <w:tcPr>
-            <w:tcW w:w="1842" w:type="dxa"/>
+            <w:tcW w:w="2122" w:type="dxa"/>
           </w:tcPr>
           <w:p>
             <w:pPr>
               <w:pStyle w:val="TextoTablas"/>
               <w:spacing w:before="0" w:after="0" w:line="360" w:lineRule="auto"/>
+              <w:jc w:val="center"/>
               <w:rPr>
                 <w:rFonts w:asciiTheme="minorHAnsi" w:hAnsiTheme="minorHAnsi" w:cstheme="minorHAnsi"/>
                 <w:sz w:val="28"/>
@@ -4698,20 +4770,22 @@
         </w:tc>
         <w:tc>
           <w:tcPr>
-            <w:tcW w:w="2836" w:type="dxa"/>
+            <w:tcW w:w="2409" w:type="dxa"/>
           </w:tcPr>
           <w:p>
             <w:pPr>
               <w:pStyle w:val="TextoTablas"/>
               <w:spacing w:before="0" w:after="0" w:line="360" w:lineRule="auto"/>
-              <w:rPr>
-                <w:rFonts w:asciiTheme="minorHAnsi" w:hAnsiTheme="minorHAnsi" w:cstheme="minorHAnsi"/>
+              <w:jc w:val="center"/>
+              <w:rPr>
+                <w:bCs/>
                 <w:sz w:val="28"/>
                 <w:szCs w:val="28"/>
               </w:rPr>
             </w:pPr>
             <w:r>
               <w:rPr>
+                <w:bCs/>
                 <w:sz w:val="28"/>
                 <w:szCs w:val="28"/>
               </w:rPr>
@@ -4721,35 +4795,57 @@
         </w:tc>
         <w:tc>
           <w:tcPr>
-            <w:tcW w:w="2551" w:type="dxa"/>
+            <w:tcW w:w="734" w:type="dxa"/>
+            <w:vMerge/>
+            <w:shd w:val="clear" w:color="auto" w:fill="FFFFFF" w:themeFill="background1"/>
           </w:tcPr>
           <w:p>
             <w:pPr>
               <w:pStyle w:val="TextoTablas"/>
               <w:spacing w:before="0" w:after="0" w:line="360" w:lineRule="auto"/>
-              <w:rPr>
-                <w:rFonts w:asciiTheme="minorHAnsi" w:hAnsiTheme="minorHAnsi" w:cstheme="minorHAnsi"/>
+              <w:jc w:val="center"/>
+              <w:rPr>
+                <w:bCs/>
                 <w:sz w:val="28"/>
                 <w:szCs w:val="28"/>
               </w:rPr>
             </w:pPr>
-            <w:r>
-              <w:rPr>
-                <w:sz w:val="28"/>
-                <w:szCs w:val="28"/>
-              </w:rPr>
-              <w:t>Tomates</w:t>
-            </w:r>
           </w:p>
         </w:tc>
         <w:tc>
           <w:tcPr>
-            <w:tcW w:w="2596" w:type="dxa"/>
+            <w:tcW w:w="2243" w:type="dxa"/>
           </w:tcPr>
           <w:p>
             <w:pPr>
               <w:pStyle w:val="TextoTablas"/>
               <w:spacing w:before="0" w:after="0" w:line="360" w:lineRule="auto"/>
+              <w:jc w:val="center"/>
+              <w:rPr>
+                <w:bCs/>
+                <w:sz w:val="28"/>
+                <w:szCs w:val="28"/>
+              </w:rPr>
+            </w:pPr>
+            <w:r>
+              <w:rPr>
+                <w:bCs/>
+                <w:sz w:val="28"/>
+                <w:szCs w:val="28"/>
+              </w:rPr>
+              <w:t>Tomates</w:t>
+            </w:r>
+          </w:p>
+        </w:tc>
+        <w:tc>
+          <w:tcPr>
+            <w:tcW w:w="2410" w:type="dxa"/>
+          </w:tcPr>
+          <w:p>
+            <w:pPr>
+              <w:pStyle w:val="TextoTablas"/>
+              <w:spacing w:before="0" w:after="0" w:line="360" w:lineRule="auto"/>
+              <w:jc w:val="center"/>
               <w:rPr>
                 <w:rFonts w:asciiTheme="minorHAnsi" w:hAnsiTheme="minorHAnsi" w:cstheme="minorHAnsi"/>
                 <w:sz w:val="28"/>
@@ -4768,16 +4864,17 @@
       </w:tr>
       <w:tr>
         <w:trPr>
-          <w:trHeight w:val="551"/>
+          <w:trHeight w:val="429"/>
         </w:trPr>
         <w:tc>
           <w:tcPr>
-            <w:tcW w:w="1842" w:type="dxa"/>
+            <w:tcW w:w="2122" w:type="dxa"/>
           </w:tcPr>
           <w:p>
             <w:pPr>
               <w:pStyle w:val="TextoTablas"/>
               <w:spacing w:before="0" w:after="0" w:line="360" w:lineRule="auto"/>
+              <w:jc w:val="center"/>
               <w:rPr>
                 <w:rFonts w:asciiTheme="minorHAnsi" w:hAnsiTheme="minorHAnsi" w:cstheme="minorHAnsi"/>
                 <w:sz w:val="28"/>
@@ -4795,20 +4892,22 @@
         </w:tc>
         <w:tc>
           <w:tcPr>
-            <w:tcW w:w="2836" w:type="dxa"/>
+            <w:tcW w:w="2409" w:type="dxa"/>
           </w:tcPr>
           <w:p>
             <w:pPr>
               <w:pStyle w:val="TextoTablas"/>
               <w:spacing w:before="0" w:after="0" w:line="360" w:lineRule="auto"/>
-              <w:rPr>
-                <w:rFonts w:asciiTheme="minorHAnsi" w:hAnsiTheme="minorHAnsi" w:cstheme="minorHAnsi"/>
+              <w:jc w:val="center"/>
+              <w:rPr>
+                <w:bCs/>
                 <w:sz w:val="28"/>
                 <w:szCs w:val="28"/>
               </w:rPr>
             </w:pPr>
             <w:r>
               <w:rPr>
+                <w:bCs/>
                 <w:sz w:val="28"/>
                 <w:szCs w:val="28"/>
               </w:rPr>
@@ -4818,35 +4917,57 @@
         </w:tc>
         <w:tc>
           <w:tcPr>
-            <w:tcW w:w="2551" w:type="dxa"/>
+            <w:tcW w:w="734" w:type="dxa"/>
+            <w:vMerge/>
+            <w:shd w:val="clear" w:color="auto" w:fill="FFFFFF" w:themeFill="background1"/>
           </w:tcPr>
           <w:p>
             <w:pPr>
               <w:pStyle w:val="TextoTablas"/>
               <w:spacing w:before="0" w:after="0" w:line="360" w:lineRule="auto"/>
-              <w:rPr>
-                <w:rFonts w:asciiTheme="minorHAnsi" w:hAnsiTheme="minorHAnsi" w:cstheme="minorHAnsi"/>
+              <w:jc w:val="center"/>
+              <w:rPr>
+                <w:bCs/>
                 <w:sz w:val="28"/>
                 <w:szCs w:val="28"/>
               </w:rPr>
             </w:pPr>
-            <w:r>
-              <w:rPr>
-                <w:sz w:val="28"/>
-                <w:szCs w:val="28"/>
-              </w:rPr>
-              <w:t>Lechuga</w:t>
-            </w:r>
           </w:p>
         </w:tc>
         <w:tc>
           <w:tcPr>
-            <w:tcW w:w="2596" w:type="dxa"/>
+            <w:tcW w:w="2243" w:type="dxa"/>
           </w:tcPr>
           <w:p>
             <w:pPr>
               <w:pStyle w:val="TextoTablas"/>
               <w:spacing w:before="0" w:after="0" w:line="360" w:lineRule="auto"/>
+              <w:jc w:val="center"/>
+              <w:rPr>
+                <w:bCs/>
+                <w:sz w:val="28"/>
+                <w:szCs w:val="28"/>
+              </w:rPr>
+            </w:pPr>
+            <w:r>
+              <w:rPr>
+                <w:bCs/>
+                <w:sz w:val="28"/>
+                <w:szCs w:val="28"/>
+              </w:rPr>
+              <w:t>Lechuga</w:t>
+            </w:r>
+          </w:p>
+        </w:tc>
+        <w:tc>
+          <w:tcPr>
+            <w:tcW w:w="2410" w:type="dxa"/>
+          </w:tcPr>
+          <w:p>
+            <w:pPr>
+              <w:pStyle w:val="TextoTablas"/>
+              <w:spacing w:before="0" w:after="0" w:line="360" w:lineRule="auto"/>
+              <w:jc w:val="center"/>
               <w:rPr>
                 <w:rFonts w:asciiTheme="minorHAnsi" w:hAnsiTheme="minorHAnsi" w:cstheme="minorHAnsi"/>
                 <w:sz w:val="28"/>
@@ -4866,16 +4987,17 @@
       <w:tr>
         <w:trPr>
           <w:cnfStyle w:val="000000100000" w:firstRow="0" w:lastRow="0" w:firstColumn="0" w:lastColumn="0" w:oddVBand="0" w:evenVBand="0" w:oddHBand="1" w:evenHBand="0" w:firstRowFirstColumn="0" w:firstRowLastColumn="0" w:lastRowFirstColumn="0" w:lastRowLastColumn="0"/>
-          <w:trHeight w:val="551"/>
+          <w:trHeight w:val="429"/>
         </w:trPr>
         <w:tc>
           <w:tcPr>
-            <w:tcW w:w="1842" w:type="dxa"/>
+            <w:tcW w:w="2122" w:type="dxa"/>
           </w:tcPr>
           <w:p>
             <w:pPr>
               <w:pStyle w:val="TextoTablas"/>
               <w:spacing w:before="0" w:after="0" w:line="360" w:lineRule="auto"/>
+              <w:jc w:val="center"/>
               <w:rPr>
                 <w:rFonts w:asciiTheme="minorHAnsi" w:hAnsiTheme="minorHAnsi" w:cstheme="minorHAnsi"/>
                 <w:sz w:val="28"/>
@@ -4893,20 +5015,22 @@
         </w:tc>
         <w:tc>
           <w:tcPr>
-            <w:tcW w:w="2836" w:type="dxa"/>
+            <w:tcW w:w="2409" w:type="dxa"/>
           </w:tcPr>
           <w:p>
             <w:pPr>
               <w:pStyle w:val="TextoTablas"/>
               <w:spacing w:before="0" w:after="0" w:line="360" w:lineRule="auto"/>
-              <w:rPr>
-                <w:rFonts w:asciiTheme="minorHAnsi" w:hAnsiTheme="minorHAnsi" w:cstheme="minorHAnsi"/>
+              <w:jc w:val="center"/>
+              <w:rPr>
+                <w:bCs/>
                 <w:sz w:val="28"/>
                 <w:szCs w:val="28"/>
               </w:rPr>
             </w:pPr>
             <w:r>
               <w:rPr>
+                <w:bCs/>
                 <w:sz w:val="28"/>
                 <w:szCs w:val="28"/>
               </w:rPr>
@@ -4916,35 +5040,57 @@
         </w:tc>
         <w:tc>
           <w:tcPr>
-            <w:tcW w:w="2551" w:type="dxa"/>
+            <w:tcW w:w="734" w:type="dxa"/>
+            <w:vMerge/>
+            <w:shd w:val="clear" w:color="auto" w:fill="FFFFFF" w:themeFill="background1"/>
           </w:tcPr>
           <w:p>
             <w:pPr>
               <w:pStyle w:val="TextoTablas"/>
               <w:spacing w:before="0" w:after="0" w:line="360" w:lineRule="auto"/>
-              <w:rPr>
-                <w:rFonts w:asciiTheme="minorHAnsi" w:hAnsiTheme="minorHAnsi" w:cstheme="minorHAnsi"/>
+              <w:jc w:val="center"/>
+              <w:rPr>
+                <w:bCs/>
                 <w:sz w:val="28"/>
                 <w:szCs w:val="28"/>
               </w:rPr>
             </w:pPr>
-            <w:r>
-              <w:rPr>
-                <w:sz w:val="28"/>
-                <w:szCs w:val="28"/>
-              </w:rPr>
-              <w:t>Apio</w:t>
-            </w:r>
           </w:p>
         </w:tc>
         <w:tc>
           <w:tcPr>
-            <w:tcW w:w="2596" w:type="dxa"/>
+            <w:tcW w:w="2243" w:type="dxa"/>
           </w:tcPr>
           <w:p>
             <w:pPr>
               <w:pStyle w:val="TextoTablas"/>
               <w:spacing w:before="0" w:after="0" w:line="360" w:lineRule="auto"/>
+              <w:jc w:val="center"/>
+              <w:rPr>
+                <w:bCs/>
+                <w:sz w:val="28"/>
+                <w:szCs w:val="28"/>
+              </w:rPr>
+            </w:pPr>
+            <w:r>
+              <w:rPr>
+                <w:bCs/>
+                <w:sz w:val="28"/>
+                <w:szCs w:val="28"/>
+              </w:rPr>
+              <w:t>Apio</w:t>
+            </w:r>
+          </w:p>
+        </w:tc>
+        <w:tc>
+          <w:tcPr>
+            <w:tcW w:w="2410" w:type="dxa"/>
+          </w:tcPr>
+          <w:p>
+            <w:pPr>
+              <w:pStyle w:val="TextoTablas"/>
+              <w:spacing w:before="0" w:after="0" w:line="360" w:lineRule="auto"/>
+              <w:jc w:val="center"/>
               <w:rPr>
                 <w:rFonts w:asciiTheme="minorHAnsi" w:hAnsiTheme="minorHAnsi" w:cstheme="minorHAnsi"/>
                 <w:sz w:val="28"/>
@@ -4963,16 +5109,17 @@
       </w:tr>
       <w:tr>
         <w:trPr>
-          <w:trHeight w:val="551"/>
+          <w:trHeight w:val="429"/>
         </w:trPr>
         <w:tc>
           <w:tcPr>
-            <w:tcW w:w="1842" w:type="dxa"/>
+            <w:tcW w:w="2122" w:type="dxa"/>
           </w:tcPr>
           <w:p>
             <w:pPr>
               <w:pStyle w:val="TextoTablas"/>
               <w:spacing w:before="0" w:after="0" w:line="360" w:lineRule="auto"/>
+              <w:jc w:val="center"/>
               <w:rPr>
                 <w:rFonts w:asciiTheme="minorHAnsi" w:hAnsiTheme="minorHAnsi" w:cstheme="minorHAnsi"/>
                 <w:sz w:val="28"/>
@@ -4990,20 +5137,22 @@
         </w:tc>
         <w:tc>
           <w:tcPr>
-            <w:tcW w:w="2836" w:type="dxa"/>
+            <w:tcW w:w="2409" w:type="dxa"/>
           </w:tcPr>
           <w:p>
             <w:pPr>
               <w:pStyle w:val="TextoTablas"/>
               <w:spacing w:before="0" w:after="0" w:line="360" w:lineRule="auto"/>
-              <w:rPr>
-                <w:rFonts w:asciiTheme="minorHAnsi" w:hAnsiTheme="minorHAnsi" w:cstheme="minorHAnsi"/>
+              <w:jc w:val="center"/>
+              <w:rPr>
+                <w:bCs/>
                 <w:sz w:val="28"/>
                 <w:szCs w:val="28"/>
               </w:rPr>
             </w:pPr>
             <w:r>
               <w:rPr>
+                <w:bCs/>
                 <w:sz w:val="28"/>
                 <w:szCs w:val="28"/>
               </w:rPr>
@@ -5013,35 +5162,57 @@
         </w:tc>
         <w:tc>
           <w:tcPr>
-            <w:tcW w:w="2551" w:type="dxa"/>
+            <w:tcW w:w="734" w:type="dxa"/>
+            <w:vMerge/>
+            <w:shd w:val="clear" w:color="auto" w:fill="FFFFFF" w:themeFill="background1"/>
           </w:tcPr>
           <w:p>
             <w:pPr>
               <w:pStyle w:val="TextoTablas"/>
               <w:spacing w:before="0" w:after="0" w:line="360" w:lineRule="auto"/>
-              <w:rPr>
-                <w:rFonts w:asciiTheme="minorHAnsi" w:hAnsiTheme="minorHAnsi" w:cstheme="minorHAnsi"/>
+              <w:jc w:val="center"/>
+              <w:rPr>
+                <w:bCs/>
                 <w:sz w:val="28"/>
                 <w:szCs w:val="28"/>
               </w:rPr>
             </w:pPr>
-            <w:r>
-              <w:rPr>
-                <w:sz w:val="28"/>
-                <w:szCs w:val="28"/>
-              </w:rPr>
-              <w:t>Cebollas</w:t>
-            </w:r>
           </w:p>
         </w:tc>
         <w:tc>
           <w:tcPr>
-            <w:tcW w:w="2596" w:type="dxa"/>
+            <w:tcW w:w="2243" w:type="dxa"/>
           </w:tcPr>
           <w:p>
             <w:pPr>
               <w:pStyle w:val="TextoTablas"/>
               <w:spacing w:before="0" w:after="0" w:line="360" w:lineRule="auto"/>
+              <w:jc w:val="center"/>
+              <w:rPr>
+                <w:bCs/>
+                <w:sz w:val="28"/>
+                <w:szCs w:val="28"/>
+              </w:rPr>
+            </w:pPr>
+            <w:r>
+              <w:rPr>
+                <w:bCs/>
+                <w:sz w:val="28"/>
+                <w:szCs w:val="28"/>
+              </w:rPr>
+              <w:t>Cebollas</w:t>
+            </w:r>
+          </w:p>
+        </w:tc>
+        <w:tc>
+          <w:tcPr>
+            <w:tcW w:w="2410" w:type="dxa"/>
+          </w:tcPr>
+          <w:p>
+            <w:pPr>
+              <w:pStyle w:val="TextoTablas"/>
+              <w:spacing w:before="0" w:after="0" w:line="360" w:lineRule="auto"/>
+              <w:jc w:val="center"/>
               <w:rPr>
                 <w:rFonts w:asciiTheme="minorHAnsi" w:hAnsiTheme="minorHAnsi" w:cstheme="minorHAnsi"/>
                 <w:sz w:val="28"/>
@@ -5061,16 +5232,17 @@
       <w:tr>
         <w:trPr>
           <w:cnfStyle w:val="000000100000" w:firstRow="0" w:lastRow="0" w:firstColumn="0" w:lastColumn="0" w:oddVBand="0" w:evenVBand="0" w:oddHBand="1" w:evenHBand="0" w:firstRowFirstColumn="0" w:firstRowLastColumn="0" w:lastRowFirstColumn="0" w:lastRowLastColumn="0"/>
-          <w:trHeight w:val="551"/>
+          <w:trHeight w:val="429"/>
         </w:trPr>
         <w:tc>
           <w:tcPr>
-            <w:tcW w:w="1842" w:type="dxa"/>
+            <w:tcW w:w="2122" w:type="dxa"/>
           </w:tcPr>
           <w:p>
             <w:pPr>
               <w:pStyle w:val="TextoTablas"/>
               <w:spacing w:before="0" w:after="0" w:line="360" w:lineRule="auto"/>
+              <w:jc w:val="center"/>
               <w:rPr>
                 <w:rFonts w:asciiTheme="minorHAnsi" w:hAnsiTheme="minorHAnsi" w:cstheme="minorHAnsi"/>
                 <w:sz w:val="28"/>
@@ -5088,20 +5260,22 @@
         </w:tc>
         <w:tc>
           <w:tcPr>
-            <w:tcW w:w="2836" w:type="dxa"/>
+            <w:tcW w:w="2409" w:type="dxa"/>
           </w:tcPr>
           <w:p>
             <w:pPr>
               <w:pStyle w:val="TextoTablas"/>
               <w:spacing w:before="0" w:after="0" w:line="360" w:lineRule="auto"/>
-              <w:rPr>
-                <w:rFonts w:asciiTheme="minorHAnsi" w:hAnsiTheme="minorHAnsi" w:cstheme="minorHAnsi"/>
+              <w:jc w:val="center"/>
+              <w:rPr>
+                <w:bCs/>
                 <w:sz w:val="28"/>
                 <w:szCs w:val="28"/>
               </w:rPr>
             </w:pPr>
             <w:r>
               <w:rPr>
+                <w:bCs/>
                 <w:sz w:val="28"/>
                 <w:szCs w:val="28"/>
               </w:rPr>
@@ -5111,35 +5285,57 @@
         </w:tc>
         <w:tc>
           <w:tcPr>
-            <w:tcW w:w="2551" w:type="dxa"/>
+            <w:tcW w:w="734" w:type="dxa"/>
+            <w:vMerge/>
+            <w:shd w:val="clear" w:color="auto" w:fill="FFFFFF" w:themeFill="background1"/>
           </w:tcPr>
           <w:p>
             <w:pPr>
               <w:pStyle w:val="TextoTablas"/>
               <w:spacing w:before="0" w:after="0" w:line="360" w:lineRule="auto"/>
-              <w:rPr>
-                <w:rFonts w:asciiTheme="minorHAnsi" w:hAnsiTheme="minorHAnsi" w:cstheme="minorHAnsi"/>
+              <w:jc w:val="center"/>
+              <w:rPr>
+                <w:bCs/>
                 <w:sz w:val="28"/>
                 <w:szCs w:val="28"/>
               </w:rPr>
             </w:pPr>
-            <w:r>
-              <w:rPr>
-                <w:sz w:val="28"/>
-                <w:szCs w:val="28"/>
-              </w:rPr>
-              <w:t>Ajos</w:t>
-            </w:r>
           </w:p>
         </w:tc>
         <w:tc>
           <w:tcPr>
-            <w:tcW w:w="2596" w:type="dxa"/>
+            <w:tcW w:w="2243" w:type="dxa"/>
           </w:tcPr>
           <w:p>
             <w:pPr>
               <w:pStyle w:val="TextoTablas"/>
               <w:spacing w:before="0" w:after="0" w:line="360" w:lineRule="auto"/>
+              <w:jc w:val="center"/>
+              <w:rPr>
+                <w:bCs/>
+                <w:sz w:val="28"/>
+                <w:szCs w:val="28"/>
+              </w:rPr>
+            </w:pPr>
+            <w:r>
+              <w:rPr>
+                <w:bCs/>
+                <w:sz w:val="28"/>
+                <w:szCs w:val="28"/>
+              </w:rPr>
+              <w:t>Ajos</w:t>
+            </w:r>
+          </w:p>
+        </w:tc>
+        <w:tc>
+          <w:tcPr>
+            <w:tcW w:w="2410" w:type="dxa"/>
+          </w:tcPr>
+          <w:p>
+            <w:pPr>
+              <w:pStyle w:val="TextoTablas"/>
+              <w:spacing w:before="0" w:after="0" w:line="360" w:lineRule="auto"/>
+              <w:jc w:val="center"/>
               <w:rPr>
                 <w:rFonts w:asciiTheme="minorHAnsi" w:hAnsiTheme="minorHAnsi" w:cstheme="minorHAnsi"/>
                 <w:sz w:val="28"/>
@@ -5158,16 +5354,17 @@
       </w:tr>
       <w:tr>
         <w:trPr>
-          <w:trHeight w:val="551"/>
+          <w:trHeight w:val="429"/>
         </w:trPr>
         <w:tc>
           <w:tcPr>
-            <w:tcW w:w="1842" w:type="dxa"/>
+            <w:tcW w:w="2122" w:type="dxa"/>
           </w:tcPr>
           <w:p>
             <w:pPr>
               <w:pStyle w:val="TextoTablas"/>
               <w:spacing w:before="0" w:after="0" w:line="360" w:lineRule="auto"/>
+              <w:jc w:val="center"/>
               <w:rPr>
                 <w:rFonts w:asciiTheme="minorHAnsi" w:hAnsiTheme="minorHAnsi" w:cstheme="minorHAnsi"/>
                 <w:sz w:val="28"/>
@@ -5185,20 +5382,22 @@
         </w:tc>
         <w:tc>
           <w:tcPr>
-            <w:tcW w:w="2836" w:type="dxa"/>
+            <w:tcW w:w="2409" w:type="dxa"/>
           </w:tcPr>
           <w:p>
             <w:pPr>
               <w:pStyle w:val="TextoTablas"/>
               <w:spacing w:before="0" w:after="0" w:line="360" w:lineRule="auto"/>
-              <w:rPr>
-                <w:rFonts w:asciiTheme="minorHAnsi" w:hAnsiTheme="minorHAnsi" w:cstheme="minorHAnsi"/>
+              <w:jc w:val="center"/>
+              <w:rPr>
+                <w:bCs/>
                 <w:sz w:val="28"/>
                 <w:szCs w:val="28"/>
               </w:rPr>
             </w:pPr>
             <w:r>
               <w:rPr>
+                <w:bCs/>
                 <w:sz w:val="28"/>
                 <w:szCs w:val="28"/>
               </w:rPr>
@@ -5208,35 +5407,57 @@
         </w:tc>
         <w:tc>
           <w:tcPr>
-            <w:tcW w:w="2551" w:type="dxa"/>
+            <w:tcW w:w="734" w:type="dxa"/>
+            <w:vMerge/>
+            <w:shd w:val="clear" w:color="auto" w:fill="FFFFFF" w:themeFill="background1"/>
           </w:tcPr>
           <w:p>
             <w:pPr>
               <w:pStyle w:val="TextoTablas"/>
               <w:spacing w:before="0" w:after="0" w:line="360" w:lineRule="auto"/>
-              <w:rPr>
-                <w:rFonts w:asciiTheme="minorHAnsi" w:hAnsiTheme="minorHAnsi" w:cstheme="minorHAnsi"/>
+              <w:jc w:val="center"/>
+              <w:rPr>
+                <w:bCs/>
                 <w:sz w:val="28"/>
                 <w:szCs w:val="28"/>
               </w:rPr>
             </w:pPr>
-            <w:r>
-              <w:rPr>
-                <w:sz w:val="28"/>
-                <w:szCs w:val="28"/>
-              </w:rPr>
-              <w:t>Patatas</w:t>
-            </w:r>
           </w:p>
         </w:tc>
         <w:tc>
           <w:tcPr>
-            <w:tcW w:w="2596" w:type="dxa"/>
+            <w:tcW w:w="2243" w:type="dxa"/>
           </w:tcPr>
           <w:p>
             <w:pPr>
               <w:pStyle w:val="TextoTablas"/>
               <w:spacing w:before="0" w:after="0" w:line="360" w:lineRule="auto"/>
+              <w:jc w:val="center"/>
+              <w:rPr>
+                <w:bCs/>
+                <w:sz w:val="28"/>
+                <w:szCs w:val="28"/>
+              </w:rPr>
+            </w:pPr>
+            <w:r>
+              <w:rPr>
+                <w:bCs/>
+                <w:sz w:val="28"/>
+                <w:szCs w:val="28"/>
+              </w:rPr>
+              <w:t>Patatas</w:t>
+            </w:r>
+          </w:p>
+        </w:tc>
+        <w:tc>
+          <w:tcPr>
+            <w:tcW w:w="2410" w:type="dxa"/>
+          </w:tcPr>
+          <w:p>
+            <w:pPr>
+              <w:pStyle w:val="TextoTablas"/>
+              <w:spacing w:before="0" w:after="0" w:line="360" w:lineRule="auto"/>
+              <w:jc w:val="center"/>
               <w:rPr>
                 <w:rFonts w:asciiTheme="minorHAnsi" w:hAnsiTheme="minorHAnsi" w:cstheme="minorHAnsi"/>
                 <w:sz w:val="28"/>
@@ -5256,16 +5477,17 @@
       <w:tr>
         <w:trPr>
           <w:cnfStyle w:val="000000100000" w:firstRow="0" w:lastRow="0" w:firstColumn="0" w:lastColumn="0" w:oddVBand="0" w:evenVBand="0" w:oddHBand="1" w:evenHBand="0" w:firstRowFirstColumn="0" w:firstRowLastColumn="0" w:lastRowFirstColumn="0" w:lastRowLastColumn="0"/>
-          <w:trHeight w:val="551"/>
+          <w:trHeight w:val="429"/>
         </w:trPr>
         <w:tc>
           <w:tcPr>
-            <w:tcW w:w="1842" w:type="dxa"/>
+            <w:tcW w:w="2122" w:type="dxa"/>
           </w:tcPr>
           <w:p>
             <w:pPr>
               <w:pStyle w:val="TextoTablas"/>
               <w:spacing w:before="0" w:after="0" w:line="360" w:lineRule="auto"/>
+              <w:jc w:val="center"/>
               <w:rPr>
                 <w:rFonts w:asciiTheme="minorHAnsi" w:hAnsiTheme="minorHAnsi" w:cstheme="minorHAnsi"/>
                 <w:sz w:val="28"/>
@@ -5283,20 +5505,22 @@
         </w:tc>
         <w:tc>
           <w:tcPr>
-            <w:tcW w:w="2836" w:type="dxa"/>
+            <w:tcW w:w="2409" w:type="dxa"/>
           </w:tcPr>
           <w:p>
             <w:pPr>
               <w:pStyle w:val="TextoTablas"/>
               <w:spacing w:before="0" w:after="0" w:line="360" w:lineRule="auto"/>
-              <w:rPr>
-                <w:rFonts w:asciiTheme="minorHAnsi" w:hAnsiTheme="minorHAnsi" w:cstheme="minorHAnsi"/>
+              <w:jc w:val="center"/>
+              <w:rPr>
+                <w:bCs/>
                 <w:sz w:val="28"/>
                 <w:szCs w:val="28"/>
               </w:rPr>
             </w:pPr>
             <w:r>
               <w:rPr>
+                <w:bCs/>
                 <w:sz w:val="28"/>
                 <w:szCs w:val="28"/>
               </w:rPr>
@@ -5306,35 +5530,57 @@
         </w:tc>
         <w:tc>
           <w:tcPr>
-            <w:tcW w:w="2551" w:type="dxa"/>
+            <w:tcW w:w="734" w:type="dxa"/>
+            <w:vMerge/>
+            <w:shd w:val="clear" w:color="auto" w:fill="FFFFFF" w:themeFill="background1"/>
           </w:tcPr>
           <w:p>
             <w:pPr>
               <w:pStyle w:val="TextoTablas"/>
               <w:spacing w:before="0" w:after="0" w:line="360" w:lineRule="auto"/>
-              <w:rPr>
-                <w:rFonts w:asciiTheme="minorHAnsi" w:hAnsiTheme="minorHAnsi" w:cstheme="minorHAnsi"/>
+              <w:jc w:val="center"/>
+              <w:rPr>
+                <w:bCs/>
                 <w:sz w:val="28"/>
                 <w:szCs w:val="28"/>
               </w:rPr>
             </w:pPr>
-            <w:r>
-              <w:rPr>
-                <w:sz w:val="28"/>
-                <w:szCs w:val="28"/>
-              </w:rPr>
-              <w:t>Guisantes</w:t>
-            </w:r>
           </w:p>
         </w:tc>
         <w:tc>
           <w:tcPr>
-            <w:tcW w:w="2596" w:type="dxa"/>
+            <w:tcW w:w="2243" w:type="dxa"/>
           </w:tcPr>
           <w:p>
             <w:pPr>
               <w:pStyle w:val="TextoTablas"/>
               <w:spacing w:before="0" w:after="0" w:line="360" w:lineRule="auto"/>
+              <w:jc w:val="center"/>
+              <w:rPr>
+                <w:bCs/>
+                <w:sz w:val="28"/>
+                <w:szCs w:val="28"/>
+              </w:rPr>
+            </w:pPr>
+            <w:r>
+              <w:rPr>
+                <w:bCs/>
+                <w:sz w:val="28"/>
+                <w:szCs w:val="28"/>
+              </w:rPr>
+              <w:t>Guisantes</w:t>
+            </w:r>
+          </w:p>
+        </w:tc>
+        <w:tc>
+          <w:tcPr>
+            <w:tcW w:w="2410" w:type="dxa"/>
+          </w:tcPr>
+          <w:p>
+            <w:pPr>
+              <w:pStyle w:val="TextoTablas"/>
+              <w:spacing w:before="0" w:after="0" w:line="360" w:lineRule="auto"/>
+              <w:jc w:val="center"/>
               <w:rPr>
                 <w:rFonts w:asciiTheme="minorHAnsi" w:hAnsiTheme="minorHAnsi" w:cstheme="minorHAnsi"/>
                 <w:sz w:val="28"/>
@@ -5353,16 +5599,17 @@
       </w:tr>
       <w:tr>
         <w:trPr>
-          <w:trHeight w:val="551"/>
+          <w:trHeight w:val="429"/>
         </w:trPr>
         <w:tc>
           <w:tcPr>
-            <w:tcW w:w="1842" w:type="dxa"/>
+            <w:tcW w:w="2122" w:type="dxa"/>
           </w:tcPr>
           <w:p>
             <w:pPr>
               <w:pStyle w:val="TextoTablas"/>
               <w:spacing w:before="0" w:after="0" w:line="360" w:lineRule="auto"/>
+              <w:jc w:val="center"/>
               <w:rPr>
                 <w:rFonts w:asciiTheme="minorHAnsi" w:hAnsiTheme="minorHAnsi" w:cstheme="minorHAnsi"/>
                 <w:sz w:val="28"/>
@@ -5380,20 +5627,22 @@
         </w:tc>
         <w:tc>
           <w:tcPr>
-            <w:tcW w:w="2836" w:type="dxa"/>
+            <w:tcW w:w="2409" w:type="dxa"/>
           </w:tcPr>
           <w:p>
             <w:pPr>
               <w:pStyle w:val="TextoTablas"/>
               <w:spacing w:before="0" w:after="0" w:line="360" w:lineRule="auto"/>
-              <w:rPr>
-                <w:rFonts w:asciiTheme="minorHAnsi" w:hAnsiTheme="minorHAnsi" w:cstheme="minorHAnsi"/>
+              <w:jc w:val="center"/>
+              <w:rPr>
+                <w:bCs/>
                 <w:sz w:val="28"/>
                 <w:szCs w:val="28"/>
               </w:rPr>
             </w:pPr>
             <w:r>
               <w:rPr>
+                <w:bCs/>
                 <w:sz w:val="28"/>
                 <w:szCs w:val="28"/>
               </w:rPr>
@@ -5403,35 +5652,57 @@
         </w:tc>
         <w:tc>
           <w:tcPr>
-            <w:tcW w:w="2551" w:type="dxa"/>
+            <w:tcW w:w="734" w:type="dxa"/>
+            <w:vMerge/>
+            <w:shd w:val="clear" w:color="auto" w:fill="FFFFFF" w:themeFill="background1"/>
           </w:tcPr>
           <w:p>
             <w:pPr>
               <w:pStyle w:val="TextoTablas"/>
               <w:spacing w:before="0" w:after="0" w:line="360" w:lineRule="auto"/>
-              <w:rPr>
-                <w:rFonts w:asciiTheme="minorHAnsi" w:hAnsiTheme="minorHAnsi" w:cstheme="minorHAnsi"/>
+              <w:jc w:val="center"/>
+              <w:rPr>
+                <w:bCs/>
                 <w:sz w:val="28"/>
                 <w:szCs w:val="28"/>
               </w:rPr>
             </w:pPr>
-            <w:r>
-              <w:rPr>
-                <w:sz w:val="28"/>
-                <w:szCs w:val="28"/>
-              </w:rPr>
-              <w:t>Puerro</w:t>
-            </w:r>
           </w:p>
         </w:tc>
         <w:tc>
           <w:tcPr>
-            <w:tcW w:w="2596" w:type="dxa"/>
+            <w:tcW w:w="2243" w:type="dxa"/>
           </w:tcPr>
           <w:p>
             <w:pPr>
               <w:pStyle w:val="TextoTablas"/>
               <w:spacing w:before="0" w:after="0" w:line="360" w:lineRule="auto"/>
+              <w:jc w:val="center"/>
+              <w:rPr>
+                <w:bCs/>
+                <w:sz w:val="28"/>
+                <w:szCs w:val="28"/>
+              </w:rPr>
+            </w:pPr>
+            <w:r>
+              <w:rPr>
+                <w:bCs/>
+                <w:sz w:val="28"/>
+                <w:szCs w:val="28"/>
+              </w:rPr>
+              <w:t>Puerro</w:t>
+            </w:r>
+          </w:p>
+        </w:tc>
+        <w:tc>
+          <w:tcPr>
+            <w:tcW w:w="2410" w:type="dxa"/>
+          </w:tcPr>
+          <w:p>
+            <w:pPr>
+              <w:pStyle w:val="TextoTablas"/>
+              <w:spacing w:before="0" w:after="0" w:line="360" w:lineRule="auto"/>
+              <w:jc w:val="center"/>
               <w:rPr>
                 <w:rFonts w:asciiTheme="minorHAnsi" w:hAnsiTheme="minorHAnsi" w:cstheme="minorHAnsi"/>
                 <w:sz w:val="28"/>
@@ -5508,51 +5779,6 @@
     </w:p>
     <w:p>
       <w:pPr>
-        <w:spacing w:after="0"/>
-        <w:rPr>
-          <w:b/>
-          <w:bCs/>
-        </w:rPr>
-      </w:pPr>
-    </w:p>
-    <w:p>
-      <w:pPr>
-        <w:spacing w:after="0"/>
-        <w:rPr>
-          <w:b/>
-          <w:bCs/>
-        </w:rPr>
-      </w:pPr>
-    </w:p>
-    <w:p>
-      <w:pPr>
-        <w:spacing w:after="0"/>
-        <w:rPr>
-          <w:b/>
-          <w:bCs/>
-        </w:rPr>
-      </w:pPr>
-    </w:p>
-    <w:p>
-      <w:pPr>
-        <w:spacing w:after="0"/>
-        <w:rPr>
-          <w:b/>
-          <w:bCs/>
-        </w:rPr>
-      </w:pPr>
-    </w:p>
-    <w:p>
-      <w:pPr>
-        <w:spacing w:after="0"/>
-        <w:rPr>
-          <w:b/>
-          <w:bCs/>
-        </w:rPr>
-      </w:pPr>
-    </w:p>
-    <w:p>
-      <w:pPr>
         <w:pStyle w:val="Figura"/>
       </w:pPr>
       <w:r>
@@ -5571,10 +5797,10 @@
           <w:noProof/>
         </w:rPr>
         <w:drawing>
-          <wp:inline distT="0" distB="0" distL="0" distR="0" wp14:anchorId="3C819B10" wp14:editId="43FAE83D">
+          <wp:inline distT="0" distB="0" distL="0" distR="0" wp14:anchorId="09A277AA" wp14:editId="351CE26F">
             <wp:extent cx="4680000" cy="4195668"/>
             <wp:effectExtent l="0" t="0" r="6350" b="0"/>
-            <wp:docPr id="1821637947" name="Gráfico 4" descr="La imagen presenta una infografía educativa sobre insectos benéficos controladores de plagas agrícolas, mostrando siete especies con ilustraciones científicas detalladas: Trichogramma (parasitoide de huevos), Coccinella septempunctata (mariquita depredadora de pulgones y cochinillas), Chrysoperla carnea (crisopa con larvas depredadoras generalistas), Episyrphus balteatus (sírfido depredador de pulgones), Carcelia spp (parasitoide de orugas) y Cotesia marginiventris (avispa parasitoide del gusano cogollero). El material está diseñado con fines didácticos para identificación entomológica en manejo integrado de plagas, incorporando nomenclatura científica binomial y fotografías realistas que facilitan el reconocimiento de estos organismos auxiliares en agroecosistemas."/>
+            <wp:docPr id="798767939" name="Gráfico 3" descr="La imagen presenta una infografía educativa sobre insectos benéficos controladores de plagas agrícolas, mostrando siete especies con ilustraciones científicas detalladas: Trichogramma (parasitoide de huevos), Coccinella septempunctata (mariquita depredadora de pulgones y cochinillas), Chrysoperla carnea (crisopa con larvas depredadoras generalistas), Episyrphus balteatus (sírfido depredador de pulgones), Carcelia spp (parasitoide de orugas) y Cotesia marginiventris (avispa parasitoide del gusano cogollero). El material está diseñado con fines didácticos para identificación entomológica en manejo integrado de plagas, incorporando nomenclatura científica binomial y fotografías realistas que facilitan el reconocimiento de estos organismos auxiliares en agroecosistemas."/>
             <wp:cNvGraphicFramePr>
               <a:graphicFrameLocks xmlns:a="http://schemas.openxmlformats.org/drawingml/2006/main" noChangeAspect="1"/>
             </wp:cNvGraphicFramePr>
@@ -5582,7 +5808,7 @@
               <a:graphicData uri="http://schemas.openxmlformats.org/drawingml/2006/picture">
                 <pic:pic xmlns:pic="http://schemas.openxmlformats.org/drawingml/2006/picture">
                   <pic:nvPicPr>
-                    <pic:cNvPr id="1821637947" name="Gráfico 4" descr="La imagen presenta una infografía educativa sobre insectos benéficos controladores de plagas agrícolas, mostrando siete especies con ilustraciones científicas detalladas: Trichogramma (parasitoide de huevos), Coccinella septempunctata (mariquita depredadora de pulgones y cochinillas), Chrysoperla carnea (crisopa con larvas depredadoras generalistas), Episyrphus balteatus (sírfido depredador de pulgones), Carcelia spp (parasitoide de orugas) y Cotesia marginiventris (avispa parasitoide del gusano cogollero). El material está diseñado con fines didácticos para identificación entomológica en manejo integrado de plagas, incorporando nomenclatura científica binomial y fotografías realistas que facilitan el reconocimiento de estos organismos auxiliares en agroecosistemas."/>
+                    <pic:cNvPr id="798767939" name="Gráfico 3" descr="La imagen presenta una infografía educativa sobre insectos benéficos controladores de plagas agrícolas, mostrando siete especies con ilustraciones científicas detalladas: Trichogramma (parasitoide de huevos), Coccinella septempunctata (mariquita depredadora de pulgones y cochinillas), Chrysoperla carnea (crisopa con larvas depredadoras generalistas), Episyrphus balteatus (sírfido depredador de pulgones), Carcelia spp (parasitoide de orugas) y Cotesia marginiventris (avispa parasitoide del gusano cogollero). El material está diseñado con fines didácticos para identificación entomológica en manejo integrado de plagas, incorporando nomenclatura científica binomial y fotografías realistas que facilitan el reconocimiento de estos organismos auxiliares en agroecosistemas."/>
                     <pic:cNvPicPr/>
                   </pic:nvPicPr>
                   <pic:blipFill>
@@ -5615,305 +5841,6 @@
     </w:p>
     <w:p>
       <w:pPr>
-        <w:spacing w:before="0" w:after="0"/>
-        <w:ind w:firstLine="708"/>
-        <w:rPr>
-          <w:b/>
-          <w:bCs/>
-        </w:rPr>
-      </w:pPr>
-      <w:r>
-        <w:rPr>
-          <w:b/>
-          <w:bCs/>
-        </w:rPr>
-        <w:t>Ejemplo de insectos benéficos</w:t>
-      </w:r>
-    </w:p>
-    <w:p>
-      <w:pPr>
-        <w:pStyle w:val="Prrafodelista"/>
-        <w:numPr>
-          <w:ilvl w:val="0"/>
-          <w:numId w:val="16"/>
-        </w:numPr>
-        <w:spacing w:before="0" w:after="0"/>
-        <w:rPr>
-          <w:rStyle w:val="Extranjerismo"/>
-          <w:b/>
-          <w:bCs/>
-        </w:rPr>
-      </w:pPr>
-      <w:r>
-        <w:rPr>
-          <w:rStyle w:val="Extranjerismo"/>
-          <w:b/>
-          <w:bCs/>
-        </w:rPr>
-        <w:t>Trichogramma</w:t>
-      </w:r>
-    </w:p>
-    <w:p>
-      <w:pPr>
-        <w:spacing w:before="0" w:after="0"/>
-        <w:ind w:left="360" w:firstLine="708"/>
-      </w:pPr>
-      <w:r>
-        <w:t>Parasitan huevos de insectos plaga.</w:t>
-      </w:r>
-    </w:p>
-    <w:p>
-      <w:pPr>
-        <w:pStyle w:val="Prrafodelista"/>
-        <w:numPr>
-          <w:ilvl w:val="0"/>
-          <w:numId w:val="16"/>
-        </w:numPr>
-        <w:spacing w:before="0" w:after="0"/>
-        <w:rPr>
-          <w:rStyle w:val="Extranjerismo"/>
-          <w:b/>
-          <w:bCs/>
-        </w:rPr>
-      </w:pPr>
-      <w:proofErr w:type="spellStart"/>
-      <w:r>
-        <w:rPr>
-          <w:rStyle w:val="Extranjerismo"/>
-          <w:b/>
-          <w:bCs/>
-        </w:rPr>
-        <w:t>Coccinella</w:t>
-      </w:r>
-      <w:proofErr w:type="spellEnd"/>
-      <w:r>
-        <w:rPr>
-          <w:rStyle w:val="Extranjerismo"/>
-          <w:b/>
-          <w:bCs/>
-        </w:rPr>
-        <w:t xml:space="preserve"> septempunctata</w:t>
-      </w:r>
-    </w:p>
-    <w:p>
-      <w:pPr>
-        <w:spacing w:before="0" w:after="0"/>
-        <w:ind w:left="360" w:firstLine="708"/>
-      </w:pPr>
-      <w:r>
-        <w:t>Un auténtico depredador de pulgones, cochinillas, ácaros y moscas blancas.</w:t>
-      </w:r>
-    </w:p>
-    <w:p>
-      <w:pPr>
-        <w:pStyle w:val="Prrafodelista"/>
-        <w:numPr>
-          <w:ilvl w:val="0"/>
-          <w:numId w:val="16"/>
-        </w:numPr>
-        <w:spacing w:before="0" w:after="0"/>
-        <w:rPr>
-          <w:rStyle w:val="Extranjerismo"/>
-          <w:b/>
-          <w:bCs/>
-        </w:rPr>
-      </w:pPr>
-      <w:proofErr w:type="spellStart"/>
-      <w:r>
-        <w:rPr>
-          <w:rStyle w:val="Extranjerismo"/>
-          <w:b/>
-          <w:bCs/>
-        </w:rPr>
-        <w:t>Chrysoperla</w:t>
-      </w:r>
-      <w:proofErr w:type="spellEnd"/>
-      <w:r>
-        <w:rPr>
-          <w:rStyle w:val="Extranjerismo"/>
-          <w:b/>
-          <w:bCs/>
-        </w:rPr>
-        <w:t xml:space="preserve"> </w:t>
-      </w:r>
-      <w:proofErr w:type="spellStart"/>
-      <w:r>
-        <w:rPr>
-          <w:rStyle w:val="Extranjerismo"/>
-          <w:b/>
-          <w:bCs/>
-        </w:rPr>
-        <w:t>carnea</w:t>
-      </w:r>
-      <w:proofErr w:type="spellEnd"/>
-    </w:p>
-    <w:p>
-      <w:pPr>
-        <w:spacing w:before="0" w:after="0"/>
-        <w:ind w:left="360" w:firstLine="708"/>
-      </w:pPr>
-      <w:r>
-        <w:t>Las larvas de las crisopas son depredadores generalistas.</w:t>
-      </w:r>
-    </w:p>
-    <w:p>
-      <w:pPr>
-        <w:pStyle w:val="Prrafodelista"/>
-        <w:numPr>
-          <w:ilvl w:val="0"/>
-          <w:numId w:val="16"/>
-        </w:numPr>
-        <w:spacing w:before="0" w:after="0"/>
-        <w:rPr>
-          <w:rStyle w:val="Extranjerismo"/>
-          <w:b/>
-          <w:bCs/>
-        </w:rPr>
-      </w:pPr>
-      <w:proofErr w:type="spellStart"/>
-      <w:r>
-        <w:rPr>
-          <w:rStyle w:val="Extranjerismo"/>
-          <w:b/>
-          <w:bCs/>
-        </w:rPr>
-        <w:t>Episyrphus</w:t>
-      </w:r>
-      <w:proofErr w:type="spellEnd"/>
-      <w:r>
-        <w:rPr>
-          <w:rStyle w:val="Extranjerismo"/>
-          <w:b/>
-          <w:bCs/>
-        </w:rPr>
-        <w:t xml:space="preserve"> </w:t>
-      </w:r>
-      <w:proofErr w:type="spellStart"/>
-      <w:r>
-        <w:rPr>
-          <w:rStyle w:val="Extranjerismo"/>
-          <w:b/>
-          <w:bCs/>
-        </w:rPr>
-        <w:t>balteatus</w:t>
-      </w:r>
-      <w:proofErr w:type="spellEnd"/>
-    </w:p>
-    <w:p>
-      <w:pPr>
-        <w:spacing w:before="0" w:after="0"/>
-        <w:ind w:left="360" w:firstLine="708"/>
-      </w:pPr>
-      <w:r>
-        <w:t>Sus larvas son voraces depredadores de pulgones, escamas, mosca blanca.</w:t>
-      </w:r>
-    </w:p>
-    <w:p>
-      <w:pPr>
-        <w:spacing w:before="0" w:after="0"/>
-        <w:ind w:firstLine="708"/>
-      </w:pPr>
-    </w:p>
-    <w:p>
-      <w:pPr>
-        <w:pStyle w:val="Prrafodelista"/>
-        <w:numPr>
-          <w:ilvl w:val="0"/>
-          <w:numId w:val="16"/>
-        </w:numPr>
-        <w:spacing w:before="0" w:after="0"/>
-        <w:rPr>
-          <w:rStyle w:val="Extranjerismo"/>
-          <w:b/>
-          <w:bCs/>
-        </w:rPr>
-      </w:pPr>
-      <w:proofErr w:type="spellStart"/>
-      <w:r>
-        <w:rPr>
-          <w:rStyle w:val="Extranjerismo"/>
-          <w:b/>
-          <w:bCs/>
-        </w:rPr>
-        <w:lastRenderedPageBreak/>
-        <w:t>Carcelia</w:t>
-      </w:r>
-      <w:proofErr w:type="spellEnd"/>
-      <w:r>
-        <w:rPr>
-          <w:rStyle w:val="Extranjerismo"/>
-          <w:b/>
-          <w:bCs/>
-        </w:rPr>
-        <w:t xml:space="preserve"> </w:t>
-      </w:r>
-      <w:proofErr w:type="spellStart"/>
-      <w:r>
-        <w:rPr>
-          <w:rStyle w:val="Extranjerismo"/>
-          <w:b/>
-          <w:bCs/>
-        </w:rPr>
-        <w:t>spp</w:t>
-      </w:r>
-      <w:proofErr w:type="spellEnd"/>
-    </w:p>
-    <w:p>
-      <w:pPr>
-        <w:spacing w:before="0" w:after="0"/>
-        <w:ind w:left="360" w:firstLine="708"/>
-      </w:pPr>
-      <w:r>
-        <w:t>Parasitan a orugas y larvas defoliadoras como el gusano peludo.</w:t>
-      </w:r>
-    </w:p>
-    <w:p>
-      <w:pPr>
-        <w:pStyle w:val="Prrafodelista"/>
-        <w:numPr>
-          <w:ilvl w:val="0"/>
-          <w:numId w:val="16"/>
-        </w:numPr>
-        <w:spacing w:before="0" w:after="0"/>
-        <w:rPr>
-          <w:rStyle w:val="Extranjerismo"/>
-          <w:b/>
-          <w:bCs/>
-        </w:rPr>
-      </w:pPr>
-      <w:r>
-        <w:rPr>
-          <w:rStyle w:val="Extranjerismo"/>
-          <w:b/>
-          <w:bCs/>
-        </w:rPr>
-        <w:t xml:space="preserve">Cotesia </w:t>
-      </w:r>
-      <w:proofErr w:type="spellStart"/>
-      <w:r>
-        <w:rPr>
-          <w:rStyle w:val="Extranjerismo"/>
-          <w:b/>
-          <w:bCs/>
-        </w:rPr>
-        <w:t>marginiventris</w:t>
-      </w:r>
-      <w:proofErr w:type="spellEnd"/>
-    </w:p>
-    <w:p>
-      <w:pPr>
-        <w:spacing w:before="0" w:after="0"/>
-        <w:ind w:left="360" w:firstLine="708"/>
-      </w:pPr>
-      <w:r>
-        <w:t>Esta avispa parasita orugas y larvas como el gusano cogollero</w:t>
-      </w:r>
-      <w:r>
-        <w:t>.</w:t>
-      </w:r>
-    </w:p>
-    <w:p>
-      <w:pPr>
         <w:pStyle w:val="Prrafodelista"/>
         <w:numPr>
           <w:ilvl w:val="0"/>
@@ -5974,6 +5901,18 @@
     </w:p>
     <w:p>
       <w:pPr>
+        <w:spacing w:before="0" w:after="0"/>
+        <w:ind w:left="1068" w:firstLine="0"/>
+      </w:pPr>
+    </w:p>
+    <w:p>
+      <w:pPr>
+        <w:spacing w:before="0" w:after="0"/>
+        <w:ind w:left="1068" w:firstLine="0"/>
+      </w:pPr>
+    </w:p>
+    <w:p>
+      <w:pPr>
         <w:pStyle w:val="Prrafodelista"/>
         <w:numPr>
           <w:ilvl w:val="0"/>
@@ -5990,6 +5929,7 @@
           <w:b/>
           <w:bCs/>
         </w:rPr>
+        <w:lastRenderedPageBreak/>
         <w:t>Fijación de nitrógeno</w:t>
       </w:r>
     </w:p>
@@ -6107,7 +6047,6 @@
           <w:b/>
           <w:bCs/>
         </w:rPr>
-        <w:lastRenderedPageBreak/>
         <w:t>Hongos</w:t>
       </w:r>
     </w:p>
@@ -6198,6 +6137,7 @@
           <w:b/>
           <w:bCs/>
         </w:rPr>
+        <w:lastRenderedPageBreak/>
         <w:t>Actinobacterias</w:t>
       </w:r>
     </w:p>
@@ -6242,18 +6182,6 @@
     </w:p>
     <w:p>
       <w:pPr>
-        <w:spacing w:before="0" w:after="0"/>
-        <w:ind w:left="1068" w:firstLine="0"/>
-      </w:pPr>
-    </w:p>
-    <w:p>
-      <w:pPr>
-        <w:spacing w:before="0" w:after="0"/>
-        <w:ind w:left="1068" w:firstLine="0"/>
-      </w:pPr>
-    </w:p>
-    <w:p>
-      <w:pPr>
         <w:pStyle w:val="Prrafodelista"/>
         <w:numPr>
           <w:ilvl w:val="0"/>
@@ -6270,7 +6198,6 @@
           <w:b/>
           <w:bCs/>
         </w:rPr>
-        <w:lastRenderedPageBreak/>
         <w:t>Protozoos</w:t>
       </w:r>
     </w:p>
@@ -6304,6 +6231,7 @@
       <w:tr>
         <w:trPr>
           <w:cnfStyle w:val="100000000000" w:firstRow="1" w:lastRow="0" w:firstColumn="0" w:lastColumn="0" w:oddVBand="0" w:evenVBand="0" w:oddHBand="0" w:evenHBand="0" w:firstRowFirstColumn="0" w:firstRowLastColumn="0" w:lastRowFirstColumn="0" w:lastRowLastColumn="0"/>
+          <w:tblHeader/>
         </w:trPr>
         <w:tc>
           <w:tcPr>
@@ -6510,7 +6438,16 @@
                 <w:sz w:val="28"/>
                 <w:szCs w:val="28"/>
               </w:rPr>
-              <w:t>Muchos microorganismos actúan como barreras naturales contra patógenos mediante competencia, producción de sustancias antimicrobianas o inducción de defensas en las plantas.</w:t>
+              <w:t xml:space="preserve">Muchos microorganismos actúan como barreras naturales contra patógenos mediante competencia, producción de </w:t>
+            </w:r>
+            <w:r>
+              <w:rPr>
+                <w:rFonts w:cs="Calibri"/>
+                <w:sz w:val="28"/>
+                <w:szCs w:val="28"/>
+              </w:rPr>
+              <w:lastRenderedPageBreak/>
+              <w:t>sustancias antimicrobianas o inducción de defensas en las plantas.</w:t>
             </w:r>
           </w:p>
         </w:tc>
@@ -6539,6 +6476,7 @@
                 <w:sz w:val="28"/>
                 <w:szCs w:val="28"/>
               </w:rPr>
+              <w:lastRenderedPageBreak/>
               <w:t>Mejora de la estructura del suelo</w:t>
             </w:r>
           </w:p>
@@ -6656,7 +6594,6 @@
           <w:b/>
           <w:bCs/>
         </w:rPr>
-        <w:lastRenderedPageBreak/>
         <w:t>Eficiencia en el uso de recursos</w:t>
       </w:r>
     </w:p>
@@ -6744,6 +6681,7 @@
         <w:ind w:left="1068" w:firstLine="348"/>
       </w:pPr>
       <w:r>
+        <w:lastRenderedPageBreak/>
         <w:t>La eficiencia en el uso de recursos contribuye a la sostenibilidad económica y ambiental de los sistemas productivos, lo que permite mantener la productividad a largo plazo.</w:t>
       </w:r>
     </w:p>
@@ -6849,16 +6787,9 @@
     <w:p>
       <w:pPr>
         <w:spacing w:before="0" w:after="0"/>
-        <w:ind w:left="1416" w:firstLine="0"/>
-      </w:pPr>
-    </w:p>
-    <w:p>
-      <w:pPr>
-        <w:spacing w:before="0" w:after="0"/>
         <w:ind w:left="1068" w:firstLine="0"/>
       </w:pPr>
       <w:r>
-        <w:lastRenderedPageBreak/>
         <w:t>La resiliencia no solo se construye desde lo ecológico, sino también desde lo social, mediante el fortalecimiento de las comunidades rurales y sus capacidades organizativas.</w:t>
       </w:r>
     </w:p>
@@ -6958,6 +6889,7 @@
         <w:spacing w:before="0" w:after="0"/>
       </w:pPr>
       <w:r>
+        <w:lastRenderedPageBreak/>
         <w:t>El aprendizaje colectivo.</w:t>
       </w:r>
     </w:p>
@@ -7022,11 +6954,7 @@
         <w:ind w:firstLine="708"/>
       </w:pPr>
       <w:r>
-        <w:t xml:space="preserve">El territorio es una construcción integral donde interactúan componentes naturales, sociales, culturales y económicos. En el enfoque agroecológico, comprender estos elementos es clave para diseñar sistemas productivos sostenibles, ya que cada </w:t>
-      </w:r>
-      <w:r>
-        <w:lastRenderedPageBreak/>
-        <w:t>uno influye directamente en la forma en que se desarrollan las actividades agrícolas y en la calidad de vida de las comunidades rurales.</w:t>
+        <w:t>El territorio es una construcción integral donde interactúan componentes naturales, sociales, culturales y económicos. En el enfoque agroecológico, comprender estos elementos es clave para diseñar sistemas productivos sostenibles, ya que cada uno influye directamente en la forma en que se desarrollan las actividades agrícolas y en la calidad de vida de las comunidades rurales.</w:t>
       </w:r>
     </w:p>
     <w:p>
@@ -7074,7 +7002,11 @@
         <w:ind w:firstLine="708"/>
       </w:pPr>
       <w:r>
+        <w:lastRenderedPageBreak/>
         <w:t>La biodiversidad incluye la variedad de especies vegetales, animales y microorganismos presentes en el territorio. Esta diversidad favorece el equilibrio ecológico, contribuye al control natural de plagas, mejora la fertilidad del suelo y fortalece la resiliencia del sistema productivo</w:t>
+      </w:r>
+      <w:r>
+        <w:t>.</w:t>
       </w:r>
     </w:p>
     <w:p>
@@ -7133,13 +7065,6 @@
     <w:p>
       <w:pPr>
         <w:pStyle w:val="Prrafodelista"/>
-        <w:spacing w:before="0" w:after="0"/>
-        <w:ind w:left="360" w:firstLine="0"/>
-      </w:pPr>
-    </w:p>
-    <w:p>
-      <w:pPr>
-        <w:pStyle w:val="Prrafodelista"/>
         <w:numPr>
           <w:ilvl w:val="0"/>
           <w:numId w:val="19"/>
@@ -7148,7 +7073,6 @@
         <w:ind w:left="1080"/>
       </w:pPr>
       <w:r>
-        <w:lastRenderedPageBreak/>
         <w:t>Fortalecer procesos organizativos.</w:t>
       </w:r>
     </w:p>
@@ -7266,6 +7190,7 @@
         <w:ind w:left="1080"/>
       </w:pPr>
       <w:r>
+        <w:lastRenderedPageBreak/>
         <w:t>Identidad y sentido de pertenencia.</w:t>
       </w:r>
     </w:p>
@@ -7345,7 +7270,6 @@
           <w:b/>
           <w:bCs/>
         </w:rPr>
-        <w:lastRenderedPageBreak/>
         <w:t>Estos elementos influyen en:</w:t>
       </w:r>
     </w:p>
@@ -7441,7 +7365,11 @@
         <w:ind w:firstLine="708"/>
       </w:pPr>
       <w:r>
-        <w:t>El enfoque territorial es fundamental en la agroecología, ya que permite comprender que los sistemas productivos no existen de manera aislada, sino que están profundamente relacionados con las características ambientales, sociales, culturales y económicas del territorio donde se desarrollan. Este enfoque reconoce que cada territorio posee condiciones particulares que influyen directamente en las prácticas agrícolas y en las formas de vida de las comunidades rurales.</w:t>
+        <w:t xml:space="preserve">El enfoque territorial es fundamental en la agroecología, ya que permite comprender que los sistemas productivos no existen de manera aislada, sino que están profundamente relacionados con las características ambientales, sociales, culturales y económicas del territorio donde se desarrollan. Este enfoque reconoce que cada </w:t>
+      </w:r>
+      <w:r>
+        <w:lastRenderedPageBreak/>
+        <w:t>territorio posee condiciones particulares que influyen directamente en las prácticas agrícolas y en las formas de vida de las comunidades rurales.</w:t>
       </w:r>
     </w:p>
     <w:p>
@@ -7461,24 +7389,9 @@
       <w:r>
         <w:t>Entre los principales aportes del enfoque territorial se destacan:</w:t>
       </w:r>
-    </w:p>
-    <w:p>
-      <w:pPr>
-        <w:spacing w:before="0" w:after="0"/>
-        <w:ind w:firstLine="708"/>
-      </w:pPr>
-    </w:p>
-    <w:p>
-      <w:pPr>
-        <w:spacing w:before="0" w:after="0"/>
-        <w:ind w:firstLine="708"/>
-      </w:pPr>
-    </w:p>
-    <w:p>
-      <w:pPr>
-        <w:spacing w:before="0" w:after="0"/>
-        <w:ind w:firstLine="708"/>
-      </w:pPr>
+      <w:r>
+        <w:tab/>
+      </w:r>
     </w:p>
     <w:p>
       <w:pPr>
@@ -7498,7 +7411,6 @@
           <w:b/>
           <w:bCs/>
         </w:rPr>
-        <w:lastRenderedPageBreak/>
         <w:t>Reconocimiento de la diversidad local</w:t>
       </w:r>
     </w:p>
@@ -7603,6 +7515,18 @@
     </w:p>
     <w:p>
       <w:pPr>
+        <w:spacing w:before="0" w:after="0"/>
+        <w:ind w:left="1068" w:firstLine="0"/>
+      </w:pPr>
+    </w:p>
+    <w:p>
+      <w:pPr>
+        <w:spacing w:before="0" w:after="0"/>
+        <w:ind w:left="1068" w:firstLine="0"/>
+      </w:pPr>
+    </w:p>
+    <w:p>
+      <w:pPr>
         <w:pStyle w:val="Prrafodelista"/>
         <w:numPr>
           <w:ilvl w:val="0"/>
@@ -7619,6 +7543,7 @@
           <w:b/>
           <w:bCs/>
         </w:rPr>
+        <w:lastRenderedPageBreak/>
         <w:t>Fomento de la participación comunitaria</w:t>
       </w:r>
     </w:p>
@@ -7656,7 +7581,6 @@
         <w:ind w:firstLine="708"/>
       </w:pPr>
       <w:r>
-        <w:lastRenderedPageBreak/>
         <w:t>A diferencia del conocimiento técnico formal, los saberes campesinos no siempre están sistematizados, pero poseen una alta capacidad de adaptación y una profunda conexión con la realidad local. En el enfoque agroecológico, estos conocimientos son fundamentales, ya que aportan soluciones prácticas, sostenibles y contextualizadas.</w:t>
       </w:r>
     </w:p>
@@ -7744,6 +7668,7 @@
           <w:b/>
           <w:bCs/>
         </w:rPr>
+        <w:lastRenderedPageBreak/>
         <w:t xml:space="preserve">Dinámicos: </w:t>
       </w:r>
       <w:r>
@@ -7802,12 +7727,6 @@
     </w:p>
     <w:p>
       <w:pPr>
-        <w:spacing w:before="0" w:after="0"/>
-        <w:ind w:firstLine="708"/>
-      </w:pPr>
-    </w:p>
-    <w:p>
-      <w:pPr>
         <w:pStyle w:val="Prrafodelista"/>
         <w:numPr>
           <w:ilvl w:val="0"/>
@@ -7824,7 +7743,6 @@
           <w:b/>
           <w:bCs/>
         </w:rPr>
-        <w:lastRenderedPageBreak/>
         <w:t xml:space="preserve">Uso de calendarios lunares: </w:t>
       </w:r>
       <w:r>
@@ -7947,6 +7865,7 @@
           <w:b/>
           <w:bCs/>
         </w:rPr>
+        <w:lastRenderedPageBreak/>
         <w:t xml:space="preserve">Permiten prácticas sostenibles: </w:t>
       </w:r>
       <w:r>
@@ -8039,7 +7958,6 @@
           <w:b/>
           <w:bCs/>
         </w:rPr>
-        <w:lastRenderedPageBreak/>
         <w:t xml:space="preserve">Promueven la soberanía alimentaria: </w:t>
       </w:r>
       <w:r>
@@ -8049,18 +7967,23 @@
     <w:p>
       <w:pPr>
         <w:pStyle w:val="Ttulo2"/>
+        <w:rPr>
+          <w:bCs/>
+          <w:lang w:val="es-CO"/>
+        </w:rPr>
       </w:pPr>
       <w:bookmarkStart w:id="7" w:name="_Toc241058487"/>
       <w:r>
-        <w:t xml:space="preserve">1.5 Relación cultura </w:t>
-      </w:r>
-      <w:r>
-        <w:t>-</w:t>
-      </w:r>
-      <w:r>
-        <w:t xml:space="preserve"> territorio - producción</w:t>
+        <w:t xml:space="preserve">1.5 </w:t>
       </w:r>
       <w:bookmarkEnd w:id="7"/>
+      <w:r>
+        <w:rPr>
+          <w:bCs/>
+          <w:lang w:val="es-CO"/>
+        </w:rPr>
+        <w:t>Relación cultura - territorio - producción</w:t>
+      </w:r>
     </w:p>
     <w:p>
       <w:pPr>
@@ -8098,6 +8021,7 @@
           <w:b/>
           <w:bCs/>
         </w:rPr>
+        <w:lastRenderedPageBreak/>
         <w:t>Aporte</w:t>
       </w:r>
     </w:p>
@@ -8160,11 +8084,7 @@
         <w:ind w:left="1080" w:firstLine="0"/>
       </w:pPr>
       <w:r>
-        <w:t xml:space="preserve">El territorio, entendido como el conjunto de condiciones naturales (clima, suelo, relieve, disponibilidad de agua), define qué tipo de cultivos pueden </w:t>
-      </w:r>
-      <w:r>
-        <w:lastRenderedPageBreak/>
-        <w:t>desarrollarse y en qué condiciones. También influye en el acceso a recursos, infraestructura y mercados, lo que condiciona las decisiones productivas y las estrategias de manejo.</w:t>
+        <w:t>El territorio, entendido como el conjunto de condiciones naturales (clima, suelo, relieve, disponibilidad de agua), define qué tipo de cultivos pueden desarrollarse y en qué condiciones. También influye en el acceso a recursos, infraestructura y mercados, lo que condiciona las decisiones productivas y las estrategias de manejo.</w:t>
       </w:r>
     </w:p>
     <w:p>
@@ -8225,7 +8145,11 @@
         <w:ind w:firstLine="708"/>
       </w:pPr>
       <w:r>
-        <w:t>La relación entre cultura, territorio y producción es dinámica y evoluciona con el tiempo. Los cambios en el entorno (climáticos, económicos o tecnológicos) generan transformaciones en las prácticas productivas, pero estas suelen adaptarse manteniendo elementos culturales propios.</w:t>
+        <w:t xml:space="preserve">La relación entre cultura, territorio y producción es dinámica y evoluciona con el tiempo. Los cambios en el entorno (climáticos, económicos o tecnológicos) generan </w:t>
+      </w:r>
+      <w:r>
+        <w:lastRenderedPageBreak/>
+        <w:t>transformaciones en las prácticas productivas, pero estas suelen adaptarse manteniendo elementos culturales propios.</w:t>
       </w:r>
     </w:p>
     <w:p>
@@ -8300,35 +8224,18 @@
     </w:p>
     <w:p>
       <w:pPr>
-        <w:spacing w:after="0"/>
+        <w:spacing w:before="0" w:after="0"/>
         <w:ind w:firstLine="708"/>
-      </w:pPr>
-    </w:p>
-    <w:p>
-      <w:pPr>
-        <w:spacing w:before="0" w:after="0"/>
-        <w:ind w:firstLine="708"/>
-        <w:rPr>
-          <w:b/>
-          <w:bCs/>
-        </w:rPr>
-      </w:pPr>
-    </w:p>
-    <w:p>
-      <w:pPr>
-        <w:spacing w:before="0" w:after="0"/>
-        <w:ind w:firstLine="708"/>
-        <w:rPr>
-          <w:b/>
-          <w:bCs/>
-        </w:rPr>
-      </w:pPr>
-      <w:r>
-        <w:rPr>
-          <w:b/>
-          <w:bCs/>
-        </w:rPr>
-        <w:lastRenderedPageBreak/>
+        <w:rPr>
+          <w:b/>
+          <w:bCs/>
+        </w:rPr>
+      </w:pPr>
+      <w:r>
+        <w:rPr>
+          <w:b/>
+          <w:bCs/>
+        </w:rPr>
         <w:t>El maíz está asociado a:</w:t>
       </w:r>
     </w:p>
@@ -8399,66 +8306,6 @@
       <w:r>
         <w:t>este ejemplo evidencia cómo la producción agrícola trasciende lo productivo y se convierte en un elemento clave de la vida social y cultural.</w:t>
       </w:r>
-    </w:p>
-    <w:p>
-      <w:pPr>
-        <w:spacing w:before="0" w:after="0"/>
-        <w:ind w:firstLine="708"/>
-      </w:pPr>
-    </w:p>
-    <w:p>
-      <w:pPr>
-        <w:spacing w:before="0" w:after="0"/>
-        <w:ind w:firstLine="708"/>
-      </w:pPr>
-    </w:p>
-    <w:p>
-      <w:pPr>
-        <w:spacing w:before="0" w:after="0"/>
-        <w:ind w:firstLine="708"/>
-      </w:pPr>
-    </w:p>
-    <w:p>
-      <w:pPr>
-        <w:spacing w:before="0" w:after="0"/>
-        <w:ind w:firstLine="708"/>
-      </w:pPr>
-    </w:p>
-    <w:p>
-      <w:pPr>
-        <w:spacing w:before="0" w:after="0"/>
-        <w:ind w:firstLine="708"/>
-      </w:pPr>
-    </w:p>
-    <w:p>
-      <w:pPr>
-        <w:spacing w:before="0" w:after="0"/>
-        <w:ind w:firstLine="708"/>
-      </w:pPr>
-    </w:p>
-    <w:p>
-      <w:pPr>
-        <w:spacing w:before="0" w:after="0"/>
-        <w:ind w:firstLine="708"/>
-      </w:pPr>
-    </w:p>
-    <w:p>
-      <w:pPr>
-        <w:spacing w:before="0" w:after="0"/>
-        <w:ind w:firstLine="708"/>
-      </w:pPr>
-    </w:p>
-    <w:p>
-      <w:pPr>
-        <w:spacing w:before="0" w:after="0"/>
-        <w:ind w:firstLine="708"/>
-      </w:pPr>
-    </w:p>
-    <w:p>
-      <w:pPr>
-        <w:spacing w:before="0" w:after="0"/>
-        <w:ind w:firstLine="708"/>
-      </w:pPr>
     </w:p>
     <w:p>
       <w:pPr>
@@ -10284,16 +10131,19 @@
       <w:tblPr>
         <w:tblStyle w:val="Tablaconcuadrcula"/>
         <w:tblW w:w="0" w:type="auto"/>
-        <w:tblInd w:w="137" w:type="dxa"/>
+        <w:tblInd w:w="-5" w:type="dxa"/>
         <w:tblLook w:val="04A0" w:firstRow="1" w:lastRow="0" w:firstColumn="1" w:lastColumn="0" w:noHBand="0" w:noVBand="1"/>
       </w:tblPr>
       <w:tblGrid>
-        <w:gridCol w:w="9781"/>
+        <w:gridCol w:w="9923"/>
       </w:tblGrid>
       <w:tr>
+        <w:trPr>
+          <w:tblHeader/>
+        </w:trPr>
         <w:tc>
           <w:tcPr>
-            <w:tcW w:w="9781" w:type="dxa"/>
+            <w:tcW w:w="9923" w:type="dxa"/>
           </w:tcPr>
           <w:p>
             <w:pPr>
@@ -10338,7 +10188,7 @@
       <w:tr>
         <w:tc>
           <w:tcPr>
-            <w:tcW w:w="9781" w:type="dxa"/>
+            <w:tcW w:w="9923" w:type="dxa"/>
           </w:tcPr>
           <w:p>
             <w:pPr>
@@ -10558,7 +10408,35 @@
                 <w:rFonts w:cs="Calibri"/>
                 <w:lang w:eastAsia="es-CO"/>
               </w:rPr>
-              <w:t xml:space="preserve">: exacto, y para que ese diálogo funcione, usamos la metodología "campesino a campesino" (CAC). </w:t>
+              <w:t>: exacto, y para que ese diálogo funcione, usamos la metodología "</w:t>
+            </w:r>
+            <w:r>
+              <w:rPr>
+                <w:rFonts w:cs="Calibri"/>
+                <w:lang w:eastAsia="es-CO"/>
+              </w:rPr>
+              <w:t>C</w:t>
+            </w:r>
+            <w:r>
+              <w:rPr>
+                <w:rFonts w:cs="Calibri"/>
+                <w:lang w:eastAsia="es-CO"/>
+              </w:rPr>
+              <w:t xml:space="preserve">ampesino a </w:t>
+            </w:r>
+            <w:r>
+              <w:rPr>
+                <w:rFonts w:cs="Calibri"/>
+                <w:lang w:eastAsia="es-CO"/>
+              </w:rPr>
+              <w:t>C</w:t>
+            </w:r>
+            <w:r>
+              <w:rPr>
+                <w:rFonts w:cs="Calibri"/>
+                <w:lang w:eastAsia="es-CO"/>
+              </w:rPr>
+              <w:t xml:space="preserve">ampesino" (CAC). </w:t>
             </w:r>
             <w:r>
               <w:rPr>
@@ -10956,6 +10834,7 @@
           <w:b/>
           <w:bCs/>
         </w:rPr>
+        <w:lastRenderedPageBreak/>
         <w:t xml:space="preserve">Bitácoras: </w:t>
       </w:r>
       <w:r>
@@ -10980,7 +10859,6 @@
           <w:b/>
           <w:bCs/>
         </w:rPr>
-        <w:lastRenderedPageBreak/>
         <w:t xml:space="preserve">Diarios de campo: </w:t>
       </w:r>
       <w:r>
@@ -11158,21 +11036,12 @@
           <w:lang w:eastAsia="es-CO"/>
         </w:rPr>
       </w:pPr>
-    </w:p>
-    <w:p>
-      <w:pPr>
-        <w:spacing w:before="0" w:after="0"/>
-        <w:ind w:firstLine="0"/>
+      <w:r>
         <w:rPr>
           <w:noProof/>
           <w:lang w:eastAsia="es-CO"/>
         </w:rPr>
-      </w:pPr>
-      <w:r>
-        <w:rPr>
-          <w:noProof/>
-          <w:lang w:eastAsia="es-CO"/>
-        </w:rPr>
+        <w:lastRenderedPageBreak/>
         <w:drawing>
           <wp:inline distT="0" distB="0" distL="0" distR="0" wp14:anchorId="7B756CB0" wp14:editId="0CF6DB1A">
             <wp:extent cx="6332220" cy="4053205"/>
@@ -11507,13 +11376,17 @@
       <w:r>
         <w:t xml:space="preserve">Fundación para el Desarrollo Socioeconómico y Restauración Ambiental (FUNDESYRAM). (2020). La </w:t>
       </w:r>
-      <w:proofErr w:type="gramStart"/>
-      <w:r>
-        <w:t>metodología campesino</w:t>
-      </w:r>
-      <w:proofErr w:type="gramEnd"/>
-      <w:r>
-        <w:t xml:space="preserve"> / campesino (CAC).</w:t>
+      <w:r>
+        <w:t xml:space="preserve">metodología Campesino </w:t>
+      </w:r>
+      <w:r>
+        <w:t xml:space="preserve">/ </w:t>
+      </w:r>
+      <w:r>
+        <w:t>C</w:t>
+      </w:r>
+      <w:r>
+        <w:t>ampesino (CAC).</w:t>
       </w:r>
     </w:p>
     <w:p>
@@ -12392,7 +12265,6 @@
         <w:docPartUnique/>
       </w:docPartObj>
     </w:sdtPr>
-    <w:sdtEndPr/>
     <w:sdtContent>
       <w:p>
         <w:pPr>
@@ -12476,7 +12348,7 @@
           <wp:extent cx="560705" cy="546100"/>
           <wp:effectExtent l="0" t="0" r="0" b="6350"/>
           <wp:wrapNone/>
-          <wp:docPr id="14" name="Gráfico 14">
+          <wp:docPr id="1260353691" name="Gráfico 1260353691">
             <a:extLst xmlns:a="http://schemas.openxmlformats.org/drawingml/2006/main">
               <a:ext uri="{C183D7F6-B498-43B3-948B-1728B52AA6E4}">
                 <adec:decorative xmlns:adec="http://schemas.microsoft.com/office/drawing/2017/decorative" val="1"/>
@@ -16670,6 +16542,155 @@
       <w:pPr>
         <w:ind w:left="6828" w:hanging="180"/>
       </w:pPr>
+    </w:lvl>
+  </w:abstractNum>
+  <w:abstractNum w:abstractNumId="37" w15:restartNumberingAfterBreak="0">
+    <w:nsid w:val="7DE34AA5"/>
+    <w:multiLevelType w:val="multilevel"/>
+    <w:tmpl w:val="E22C6E56"/>
+    <w:lvl w:ilvl="0">
+      <w:start w:val="1"/>
+      <w:numFmt w:val="bullet"/>
+      <w:lvlText w:val=""/>
+      <w:lvlJc w:val="left"/>
+      <w:pPr>
+        <w:tabs>
+          <w:tab w:val="num" w:pos="720"/>
+        </w:tabs>
+        <w:ind w:left="720" w:hanging="360"/>
+      </w:pPr>
+      <w:rPr>
+        <w:rFonts w:ascii="Symbol" w:hAnsi="Symbol" w:hint="default"/>
+        <w:sz w:val="20"/>
+      </w:rPr>
+    </w:lvl>
+    <w:lvl w:ilvl="1" w:tentative="1">
+      <w:start w:val="1"/>
+      <w:numFmt w:val="bullet"/>
+      <w:lvlText w:val="o"/>
+      <w:lvlJc w:val="left"/>
+      <w:pPr>
+        <w:tabs>
+          <w:tab w:val="num" w:pos="1440"/>
+        </w:tabs>
+        <w:ind w:left="1440" w:hanging="360"/>
+      </w:pPr>
+      <w:rPr>
+        <w:rFonts w:ascii="Courier New" w:hAnsi="Courier New" w:hint="default"/>
+        <w:sz w:val="20"/>
+      </w:rPr>
+    </w:lvl>
+    <w:lvl w:ilvl="2" w:tentative="1">
+      <w:start w:val="1"/>
+      <w:numFmt w:val="bullet"/>
+      <w:lvlText w:val=""/>
+      <w:lvlJc w:val="left"/>
+      <w:pPr>
+        <w:tabs>
+          <w:tab w:val="num" w:pos="2160"/>
+        </w:tabs>
+        <w:ind w:left="2160" w:hanging="360"/>
+      </w:pPr>
+      <w:rPr>
+        <w:rFonts w:ascii="Wingdings" w:hAnsi="Wingdings" w:hint="default"/>
+        <w:sz w:val="20"/>
+      </w:rPr>
+    </w:lvl>
+    <w:lvl w:ilvl="3" w:tentative="1">
+      <w:start w:val="1"/>
+      <w:numFmt w:val="bullet"/>
+      <w:lvlText w:val=""/>
+      <w:lvlJc w:val="left"/>
+      <w:pPr>
+        <w:tabs>
+          <w:tab w:val="num" w:pos="2880"/>
+        </w:tabs>
+        <w:ind w:left="2880" w:hanging="360"/>
+      </w:pPr>
+      <w:rPr>
+        <w:rFonts w:ascii="Wingdings" w:hAnsi="Wingdings" w:hint="default"/>
+        <w:sz w:val="20"/>
+      </w:rPr>
+    </w:lvl>
+    <w:lvl w:ilvl="4" w:tentative="1">
+      <w:start w:val="1"/>
+      <w:numFmt w:val="bullet"/>
+      <w:lvlText w:val=""/>
+      <w:lvlJc w:val="left"/>
+      <w:pPr>
+        <w:tabs>
+          <w:tab w:val="num" w:pos="3600"/>
+        </w:tabs>
+        <w:ind w:left="3600" w:hanging="360"/>
+      </w:pPr>
+      <w:rPr>
+        <w:rFonts w:ascii="Wingdings" w:hAnsi="Wingdings" w:hint="default"/>
+        <w:sz w:val="20"/>
+      </w:rPr>
+    </w:lvl>
+    <w:lvl w:ilvl="5" w:tentative="1">
+      <w:start w:val="1"/>
+      <w:numFmt w:val="bullet"/>
+      <w:lvlText w:val=""/>
+      <w:lvlJc w:val="left"/>
+      <w:pPr>
+        <w:tabs>
+          <w:tab w:val="num" w:pos="4320"/>
+        </w:tabs>
+        <w:ind w:left="4320" w:hanging="360"/>
+      </w:pPr>
+      <w:rPr>
+        <w:rFonts w:ascii="Wingdings" w:hAnsi="Wingdings" w:hint="default"/>
+        <w:sz w:val="20"/>
+      </w:rPr>
+    </w:lvl>
+    <w:lvl w:ilvl="6" w:tentative="1">
+      <w:start w:val="1"/>
+      <w:numFmt w:val="bullet"/>
+      <w:lvlText w:val=""/>
+      <w:lvlJc w:val="left"/>
+      <w:pPr>
+        <w:tabs>
+          <w:tab w:val="num" w:pos="5040"/>
+        </w:tabs>
+        <w:ind w:left="5040" w:hanging="360"/>
+      </w:pPr>
+      <w:rPr>
+        <w:rFonts w:ascii="Wingdings" w:hAnsi="Wingdings" w:hint="default"/>
+        <w:sz w:val="20"/>
+      </w:rPr>
+    </w:lvl>
+    <w:lvl w:ilvl="7" w:tentative="1">
+      <w:start w:val="1"/>
+      <w:numFmt w:val="bullet"/>
+      <w:lvlText w:val=""/>
+      <w:lvlJc w:val="left"/>
+      <w:pPr>
+        <w:tabs>
+          <w:tab w:val="num" w:pos="5760"/>
+        </w:tabs>
+        <w:ind w:left="5760" w:hanging="360"/>
+      </w:pPr>
+      <w:rPr>
+        <w:rFonts w:ascii="Wingdings" w:hAnsi="Wingdings" w:hint="default"/>
+        <w:sz w:val="20"/>
+      </w:rPr>
+    </w:lvl>
+    <w:lvl w:ilvl="8" w:tentative="1">
+      <w:start w:val="1"/>
+      <w:numFmt w:val="bullet"/>
+      <w:lvlText w:val=""/>
+      <w:lvlJc w:val="left"/>
+      <w:pPr>
+        <w:tabs>
+          <w:tab w:val="num" w:pos="6480"/>
+        </w:tabs>
+        <w:ind w:left="6480" w:hanging="360"/>
+      </w:pPr>
+      <w:rPr>
+        <w:rFonts w:ascii="Wingdings" w:hAnsi="Wingdings" w:hint="default"/>
+        <w:sz w:val="20"/>
+      </w:rPr>
     </w:lvl>
   </w:abstractNum>
   <w:num w:numId="1" w16cid:durableId="1577780524">
@@ -16782,6 +16803,9 @@
   </w:num>
   <w:num w:numId="37" w16cid:durableId="2019769903">
     <w:abstractNumId w:val="3"/>
+  </w:num>
+  <w:num w:numId="38" w16cid:durableId="508716620">
+    <w:abstractNumId w:val="37"/>
   </w:num>
   <w:numIdMacAtCleanup w:val="12"/>
 </w:numbering>

</xml_diff>